<commit_message>
feat: generalizar el análisis a cualquier canción (3 casos reales)
- Script con funciones y datos en CSV (datos/), tabla y gráfico comparativos
- Validación del pico de la cúbica (a < 0 y dentro del rango)
- Casos: Rosa Pastel, Ella Baila Sola y Tití Me Preguntó (Spotify México, kworb.net)
- Informe, presentación y README actualizados con la generalización

Co-Authored-By: Claude Opus 5.5 <noreply@anthropic.com>
</commit_message>
<xml_diff>
--- a/Informe_Proyecto_Metodos_Numericos_Rosa_Pastel.docx
+++ b/Informe_Proyecto_Metodos_Numericos_Rosa_Pastel.docx
@@ -449,7 +449,7 @@
           <w:rFonts w:ascii="Calibri" w:hAnsi="Calibri"/>
           <w:sz w:val="21"/>
         </w:rPr>
-        <w:t xml:space="preserve">   3.4 Diferenciación Numérica: Ritmo Semanal de Streams y Pico de Demanda</w:t>
+        <w:t xml:space="preserve">   3.4 Diferenciación Numérica: Ritmo Semanal de Streams</w:t>
       </w:r>
       <w:r>
         <w:rPr>
@@ -457,7 +457,7 @@
           <w:color w:val="8A8A8A"/>
           <w:sz w:val="20"/>
         </w:rPr>
-        <w:t xml:space="preserve">  </w:t>
+        <w:t xml:space="preserve"> ............ </w:t>
       </w:r>
       <w:r>
         <w:rPr>
@@ -477,7 +477,35 @@
           <w:rFonts w:ascii="Calibri" w:hAnsi="Calibri"/>
           <w:sz w:val="21"/>
         </w:rPr>
-        <w:t xml:space="preserve">   3.5 Limitaciones del Modelo Numérico</w:t>
+        <w:t xml:space="preserve">   3.5 Localización del Pico de Demanda y Análisis de Viralidad</w:t>
+      </w:r>
+      <w:r>
+        <w:rPr>
+          <w:rFonts w:ascii="Calibri" w:hAnsi="Calibri"/>
+          <w:color w:val="8A8A8A"/>
+          <w:sz w:val="20"/>
+        </w:rPr>
+        <w:t xml:space="preserve"> ..... </w:t>
+      </w:r>
+      <w:r>
+        <w:rPr>
+          <w:rFonts w:ascii="Calibri" w:hAnsi="Calibri"/>
+          <w:b/>
+          <w:sz w:val="21"/>
+        </w:rPr>
+        <w:t>12</w:t>
+      </w:r>
+    </w:p>
+    <w:p>
+      <w:pPr>
+        <w:spacing w:after="60" w:line="276" w:lineRule="auto"/>
+      </w:pPr>
+      <w:r>
+        <w:rPr>
+          <w:rFonts w:ascii="Calibri" w:hAnsi="Calibri"/>
+          <w:sz w:val="21"/>
+        </w:rPr>
+        <w:t xml:space="preserve">   3.6 Generalización a otras canciones</w:t>
       </w:r>
       <w:r>
         <w:rPr>
@@ -505,6 +533,34 @@
           <w:rFonts w:ascii="Calibri" w:hAnsi="Calibri"/>
           <w:sz w:val="21"/>
         </w:rPr>
+        <w:t xml:space="preserve">   3.7 Limitaciones del Modelo Numérico</w:t>
+      </w:r>
+      <w:r>
+        <w:rPr>
+          <w:rFonts w:ascii="Calibri" w:hAnsi="Calibri"/>
+          <w:color w:val="8A8A8A"/>
+          <w:sz w:val="20"/>
+        </w:rPr>
+        <w:t xml:space="preserve"> ............................. </w:t>
+      </w:r>
+      <w:r>
+        <w:rPr>
+          <w:rFonts w:ascii="Calibri" w:hAnsi="Calibri"/>
+          <w:b/>
+          <w:sz w:val="21"/>
+        </w:rPr>
+        <w:t>15</w:t>
+      </w:r>
+    </w:p>
+    <w:p>
+      <w:pPr>
+        <w:spacing w:after="60" w:line="276" w:lineRule="auto"/>
+      </w:pPr>
+      <w:r>
+        <w:rPr>
+          <w:rFonts w:ascii="Calibri" w:hAnsi="Calibri"/>
+          <w:sz w:val="21"/>
+        </w:rPr>
         <w:t>4. CONCLUSIONES Y DISCUSIÓN ACADÉMICA</w:t>
       </w:r>
       <w:r>
@@ -521,7 +577,7 @@
           <w:b/>
           <w:sz w:val="21"/>
         </w:rPr>
-        <w:t>14</w:t>
+        <w:t>16</w:t>
       </w:r>
     </w:p>
     <w:p>
@@ -549,7 +605,7 @@
           <w:b/>
           <w:sz w:val="21"/>
         </w:rPr>
-        <w:t>15</w:t>
+        <w:t>17</w:t>
       </w:r>
     </w:p>
     <w:p>
@@ -592,7 +648,7 @@
         <w:spacing w:after="160"/>
       </w:pPr>
       <w:r>
-        <w:t>El presente proyecto integrador tiene como objetivo modelar matemáticamente, a través de métodos numéricos, el resurgimiento de la canción "Rosa Pastel" de la banda mexicana Belanova durante el año 2023 en Spotify México. La canción, lanzada como sencillo en 2006 (álbum Dulce Beat), volvió a entrar en los rankings (puesto 22 del chart semanal de Spotify México) tras popularizarse en la red social TikTok a mediados de 2023. A partir de los registros semanales de streaming recopilados durante ese año, se busca ajustar un modelo continuo, estimar en qué momento se alcanzaron los 100 millones de reproducciones acumuladas y analizar el ritmo semanal de consumo.</w:t>
+        <w:t>El presente proyecto integrador tiene como objetivo modelar matemáticamente, a través de métodos numéricos, el resurgimiento de la canción "Rosa Pastel" de la banda mexicana Belanova durante el año 2023 en Spotify México. La canción, lanzada como sencillo en 2006 (álbum Dulce Beat), volvió a entrar en los rankings (puesto 22 del chart semanal de Spotify México) tras popularizarse en la red social TikTok a mediados de 2023. A partir de los registros semanales de streaming recopilados durante ese año, se busca ajustar un modelo continuo, estimar en qué momento se alcanzaron los 100 millones de reproducciones acumuladas y analizar el ritmo semanal de consumo. Asimismo, el método se implementó como una herramienta general y se probó con 3 canciones con diversas dinámicas de consumo para verificar su aplicabilidad, robustez algorítmica y límites de validez en un contexto de ingeniería.</w:t>
       </w:r>
     </w:p>
     <w:p>
@@ -9566,7 +9622,7 @@
           <w:color w:val="1F4E79"/>
           <w:sz w:val="25"/>
         </w:rPr>
-        <w:t>3.4 Diferenciación Numérica: Ritmo Semanal de Streams y Pico de Demanda</w:t>
+        <w:t>3.4 Diferenciación Numérica: Ritmo Semanal de Streams</w:t>
       </w:r>
     </w:p>
     <w:p>
@@ -11023,12 +11079,32 @@
       </w:tr>
     </w:tbl>
     <w:p>
+      <w:r>
+        <w:br w:type="page"/>
+      </w:r>
+    </w:p>
+    <w:p>
+      <w:pPr>
+        <w:keepNext/>
+        <w:spacing w:before="280" w:after="120"/>
+      </w:pPr>
+      <w:r>
+        <w:rPr>
+          <w:rFonts w:ascii="Calibri" w:hAnsi="Calibri"/>
+          <w:b/>
+          <w:color w:val="1F4E79"/>
+          <w:sz w:val="25"/>
+        </w:rPr>
+        <w:t>3.5 Localización del Pico de Demanda y Punto de Inflexión</w:t>
+      </w:r>
+    </w:p>
+    <w:p>
       <w:pPr>
         <w:spacing w:after="200"/>
       </w:pPr>
       <w:r>
+        <w:t>El análisis diferencial permite contrastar la predicción teórica del modelo frente al comportamiento empírico de la demanda:</w:t>
         <w:br/>
-        <w:t>Localización del Pico de Reproducciones:</w:t>
         <w:br/>
         <w:t>• Según el modelo analítico: El ritmo máximo se produce en el punto de inflexión de la curva cúbica, donde la derivada segunda se anula (S''(t) = 0):</w:t>
         <w:br/>
@@ -11109,7 +11185,1098 @@
           <w:color w:val="1F4E79"/>
           <w:sz w:val="25"/>
         </w:rPr>
-        <w:t>3.5 Limitaciones del Modelo Numérico</w:t>
+        <w:t>3.6 Generalización a otras canciones</w:t>
+      </w:r>
+    </w:p>
+    <w:p>
+      <w:pPr>
+        <w:spacing w:after="120"/>
+      </w:pPr>
+      <w:r>
+        <w:t>A fin de responder al requerimiento de la cátedra respecto a que la metodología sirva como una herramienta generalizable de ingeniería, el script de cálculo se estructuró de forma completamente modular. Mediante la función analizar_cancion(nombre, csv, meta), el sistema es capaz de procesar cualquier serie temporal histórica de streams semanales obtenida de los charts oficiales (kworb.net). Incorporar una nueva canción únicamente requiere agregar el archivo CSV en la carpeta datos/ y registrar una línea con su nombre y meta en la lista del script.</w:t>
+        <w:br/>
+        <w:br/>
+        <w:t>Para evaluar el alcance y los límites del enfoque numérico, se contrastó el caso de "Rosa Pastel" (resurgimiento gradual de catálogo impulsado por redes) frente a dos estrenos comerciales masivos en Spotify México: "Ella Baila Sola" (Eslabón Armado y Peso Pluma, 2023) y "Tití Me Preguntó" (Bad Bunny, 2022). Los resultados comparativos obtenidos se resumen en la siguiente tabla:</w:t>
+      </w:r>
+    </w:p>
+    <w:tbl>
+      <w:tblPr>
+        <w:tblW w:type="auto" w:w="0"/>
+        <w:jc w:val="center"/>
+        <w:tblLook w:firstColumn="1" w:firstRow="1" w:lastColumn="0" w:lastRow="0" w:noHBand="0" w:noVBand="1" w:val="04A0"/>
+      </w:tblPr>
+      <w:tblGrid>
+        <w:gridCol w:w="936"/>
+        <w:gridCol w:w="936"/>
+        <w:gridCol w:w="936"/>
+        <w:gridCol w:w="936"/>
+        <w:gridCol w:w="936"/>
+        <w:gridCol w:w="936"/>
+        <w:gridCol w:w="936"/>
+        <w:gridCol w:w="936"/>
+        <w:gridCol w:w="936"/>
+        <w:gridCol w:w="936"/>
+      </w:tblGrid>
+      <w:tr>
+        <w:tc>
+          <w:tcPr>
+            <w:tcW w:type="dxa" w:w="1728"/>
+            <w:shd w:val="clear" w:color="auto" w:fill="1F4E79"/>
+            <w:tcMar>
+              <w:top w:w="80" w:type="dxa"/>
+              <w:bottom w:w="80" w:type="dxa"/>
+              <w:left w:w="100" w:type="dxa"/>
+              <w:right w:w="100" w:type="dxa"/>
+            </w:tcMar>
+          </w:tcPr>
+          <w:p>
+            <w:pPr>
+              <w:jc w:val="center"/>
+            </w:pPr>
+            <w:r>
+              <w:rPr>
+                <w:rFonts w:ascii="Calibri" w:hAnsi="Calibri"/>
+                <w:b/>
+                <w:color w:val="FFFFFF"/>
+                <w:sz w:val="19"/>
+              </w:rPr>
+              <w:t>Canción</w:t>
+            </w:r>
+          </w:p>
+        </w:tc>
+        <w:tc>
+          <w:tcPr>
+            <w:tcW w:type="dxa" w:w="1152"/>
+            <w:shd w:val="clear" w:color="auto" w:fill="1F4E79"/>
+            <w:tcMar>
+              <w:top w:w="80" w:type="dxa"/>
+              <w:bottom w:w="80" w:type="dxa"/>
+              <w:left w:w="100" w:type="dxa"/>
+              <w:right w:w="100" w:type="dxa"/>
+            </w:tcMar>
+          </w:tcPr>
+          <w:p>
+            <w:pPr>
+              <w:jc w:val="center"/>
+            </w:pPr>
+            <w:r>
+              <w:rPr>
+                <w:rFonts w:ascii="Calibri" w:hAnsi="Calibri"/>
+                <w:b/>
+                <w:color w:val="FFFFFF"/>
+                <w:sz w:val="19"/>
+              </w:rPr>
+              <w:t>Semanas (desde)</w:t>
+            </w:r>
+          </w:p>
+        </w:tc>
+        <w:tc>
+          <w:tcPr>
+            <w:tcW w:type="dxa" w:w="648"/>
+            <w:shd w:val="clear" w:color="auto" w:fill="1F4E79"/>
+            <w:tcMar>
+              <w:top w:w="80" w:type="dxa"/>
+              <w:bottom w:w="80" w:type="dxa"/>
+              <w:left w:w="100" w:type="dxa"/>
+              <w:right w:w="100" w:type="dxa"/>
+            </w:tcMar>
+          </w:tcPr>
+          <w:p>
+            <w:pPr>
+              <w:jc w:val="center"/>
+            </w:pPr>
+            <w:r>
+              <w:rPr>
+                <w:rFonts w:ascii="Calibri" w:hAnsi="Calibri"/>
+                <w:b/>
+                <w:color w:val="FFFFFF"/>
+                <w:sz w:val="19"/>
+              </w:rPr>
+              <w:t>Total M</w:t>
+            </w:r>
+          </w:p>
+        </w:tc>
+        <w:tc>
+          <w:tcPr>
+            <w:tcW w:type="dxa" w:w="792"/>
+            <w:shd w:val="clear" w:color="auto" w:fill="1F4E79"/>
+            <w:tcMar>
+              <w:top w:w="80" w:type="dxa"/>
+              <w:bottom w:w="80" w:type="dxa"/>
+              <w:left w:w="100" w:type="dxa"/>
+              <w:right w:w="100" w:type="dxa"/>
+            </w:tcMar>
+          </w:tcPr>
+          <w:p>
+            <w:pPr>
+              <w:jc w:val="center"/>
+            </w:pPr>
+            <w:r>
+              <w:rPr>
+                <w:rFonts w:ascii="Calibri" w:hAnsi="Calibri"/>
+                <w:b/>
+                <w:color w:val="FFFFFF"/>
+                <w:sz w:val="19"/>
+              </w:rPr>
+              <w:t>R²</w:t>
+            </w:r>
+          </w:p>
+        </w:tc>
+        <w:tc>
+          <w:tcPr>
+            <w:tcW w:type="dxa" w:w="648"/>
+            <w:shd w:val="clear" w:color="auto" w:fill="1F4E79"/>
+            <w:tcMar>
+              <w:top w:w="80" w:type="dxa"/>
+              <w:bottom w:w="80" w:type="dxa"/>
+              <w:left w:w="100" w:type="dxa"/>
+              <w:right w:w="100" w:type="dxa"/>
+            </w:tcMar>
+          </w:tcPr>
+          <w:p>
+            <w:pPr>
+              <w:jc w:val="center"/>
+            </w:pPr>
+            <w:r>
+              <w:rPr>
+                <w:rFonts w:ascii="Calibri" w:hAnsi="Calibri"/>
+                <w:b/>
+                <w:color w:val="FFFFFF"/>
+                <w:sz w:val="19"/>
+              </w:rPr>
+              <w:t>Sy/x M</w:t>
+            </w:r>
+          </w:p>
+        </w:tc>
+        <w:tc>
+          <w:tcPr>
+            <w:tcW w:type="dxa" w:w="1224"/>
+            <w:shd w:val="clear" w:color="auto" w:fill="1F4E79"/>
+            <w:tcMar>
+              <w:top w:w="80" w:type="dxa"/>
+              <w:bottom w:w="80" w:type="dxa"/>
+              <w:left w:w="100" w:type="dxa"/>
+              <w:right w:w="100" w:type="dxa"/>
+            </w:tcMar>
+          </w:tcPr>
+          <w:p>
+            <w:pPr>
+              <w:jc w:val="center"/>
+            </w:pPr>
+            <w:r>
+              <w:rPr>
+                <w:rFonts w:ascii="Calibri" w:hAnsi="Calibri"/>
+                <w:b/>
+                <w:color w:val="FFFFFF"/>
+                <w:sz w:val="19"/>
+              </w:rPr>
+              <w:t>Hito 100 M (semana, Newton)</w:t>
+            </w:r>
+          </w:p>
+        </w:tc>
+        <w:tc>
+          <w:tcPr>
+            <w:tcW w:type="dxa" w:w="792"/>
+            <w:shd w:val="clear" w:color="auto" w:fill="1F4E79"/>
+            <w:tcMar>
+              <w:top w:w="80" w:type="dxa"/>
+              <w:bottom w:w="80" w:type="dxa"/>
+              <w:left w:w="100" w:type="dxa"/>
+              <w:right w:w="100" w:type="dxa"/>
+            </w:tcMar>
+          </w:tcPr>
+          <w:p>
+            <w:pPr>
+              <w:jc w:val="center"/>
+            </w:pPr>
+            <w:r>
+              <w:rPr>
+                <w:rFonts w:ascii="Calibri" w:hAnsi="Calibri"/>
+                <w:b/>
+                <w:color w:val="FFFFFF"/>
+                <w:sz w:val="19"/>
+              </w:rPr>
+              <w:t>Iter. bis./Newton</w:t>
+            </w:r>
+          </w:p>
+        </w:tc>
+        <w:tc>
+          <w:tcPr>
+            <w:tcW w:type="dxa" w:w="1080"/>
+            <w:shd w:val="clear" w:color="auto" w:fill="1F4E79"/>
+            <w:tcMar>
+              <w:top w:w="80" w:type="dxa"/>
+              <w:bottom w:w="80" w:type="dxa"/>
+              <w:left w:w="100" w:type="dxa"/>
+              <w:right w:w="100" w:type="dxa"/>
+            </w:tcMar>
+          </w:tcPr>
+          <w:p>
+            <w:pPr>
+              <w:jc w:val="center"/>
+            </w:pPr>
+            <w:r>
+              <w:rPr>
+                <w:rFonts w:ascii="Calibri" w:hAnsi="Calibri"/>
+                <w:b/>
+                <w:color w:val="FFFFFF"/>
+                <w:sz w:val="19"/>
+              </w:rPr>
+              <w:t>Pico modelo</w:t>
+            </w:r>
+          </w:p>
+        </w:tc>
+        <w:tc>
+          <w:tcPr>
+            <w:tcW w:type="dxa" w:w="1080"/>
+            <w:shd w:val="clear" w:color="auto" w:fill="1F4E79"/>
+            <w:tcMar>
+              <w:top w:w="80" w:type="dxa"/>
+              <w:bottom w:w="80" w:type="dxa"/>
+              <w:left w:w="100" w:type="dxa"/>
+              <w:right w:w="100" w:type="dxa"/>
+            </w:tcMar>
+          </w:tcPr>
+          <w:p>
+            <w:pPr>
+              <w:jc w:val="center"/>
+            </w:pPr>
+            <w:r>
+              <w:rPr>
+                <w:rFonts w:ascii="Calibri" w:hAnsi="Calibri"/>
+                <w:b/>
+                <w:color w:val="FFFFFF"/>
+                <w:sz w:val="19"/>
+              </w:rPr>
+              <w:t>Pico datos</w:t>
+            </w:r>
+          </w:p>
+        </w:tc>
+        <w:tc>
+          <w:tcPr>
+            <w:tcW w:type="dxa" w:w="720"/>
+            <w:shd w:val="clear" w:color="auto" w:fill="1F4E79"/>
+            <w:tcMar>
+              <w:top w:w="80" w:type="dxa"/>
+              <w:bottom w:w="80" w:type="dxa"/>
+              <w:left w:w="100" w:type="dxa"/>
+              <w:right w:w="100" w:type="dxa"/>
+            </w:tcMar>
+          </w:tcPr>
+          <w:p>
+            <w:pPr>
+              <w:jc w:val="center"/>
+            </w:pPr>
+            <w:r>
+              <w:rPr>
+                <w:rFonts w:ascii="Calibri" w:hAnsi="Calibri"/>
+                <w:b/>
+                <w:color w:val="FFFFFF"/>
+                <w:sz w:val="19"/>
+              </w:rPr>
+              <w:t>Diagnóstico</w:t>
+            </w:r>
+          </w:p>
+        </w:tc>
+      </w:tr>
+      <w:tr>
+        <w:tc>
+          <w:tcPr>
+            <w:tcW w:type="dxa" w:w="936"/>
+            <w:tcMar>
+              <w:top w:w="30" w:type="dxa"/>
+              <w:bottom w:w="30" w:type="dxa"/>
+              <w:left w:w="40" w:type="dxa"/>
+              <w:right w:w="40" w:type="dxa"/>
+            </w:tcMar>
+          </w:tcPr>
+          <w:p>
+            <w:pPr>
+              <w:jc w:val="left"/>
+            </w:pPr>
+            <w:r>
+              <w:rPr>
+                <w:rFonts w:ascii="Calibri" w:hAnsi="Calibri"/>
+                <w:sz w:val="15"/>
+              </w:rPr>
+              <w:t>Rosa Pastel (Belanova)</w:t>
+            </w:r>
+          </w:p>
+        </w:tc>
+        <w:tc>
+          <w:tcPr>
+            <w:tcW w:type="dxa" w:w="936"/>
+            <w:tcMar>
+              <w:top w:w="30" w:type="dxa"/>
+              <w:bottom w:w="30" w:type="dxa"/>
+              <w:left w:w="40" w:type="dxa"/>
+              <w:right w:w="40" w:type="dxa"/>
+            </w:tcMar>
+          </w:tcPr>
+          <w:p>
+            <w:pPr>
+              <w:jc w:val="center"/>
+            </w:pPr>
+            <w:r>
+              <w:rPr>
+                <w:rFonts w:ascii="Calibri" w:hAnsi="Calibri"/>
+                <w:sz w:val="15"/>
+              </w:rPr>
+              <w:t>47 (26/01/2023)</w:t>
+            </w:r>
+          </w:p>
+        </w:tc>
+        <w:tc>
+          <w:tcPr>
+            <w:tcW w:type="dxa" w:w="936"/>
+            <w:tcMar>
+              <w:top w:w="30" w:type="dxa"/>
+              <w:bottom w:w="30" w:type="dxa"/>
+              <w:left w:w="40" w:type="dxa"/>
+              <w:right w:w="40" w:type="dxa"/>
+            </w:tcMar>
+          </w:tcPr>
+          <w:p>
+            <w:pPr>
+              <w:jc w:val="center"/>
+            </w:pPr>
+            <w:r>
+              <w:rPr>
+                <w:rFonts w:ascii="Calibri" w:hAnsi="Calibri"/>
+                <w:sz w:val="15"/>
+              </w:rPr>
+              <w:t>132.9</w:t>
+            </w:r>
+          </w:p>
+        </w:tc>
+        <w:tc>
+          <w:tcPr>
+            <w:tcW w:type="dxa" w:w="936"/>
+            <w:tcMar>
+              <w:top w:w="30" w:type="dxa"/>
+              <w:bottom w:w="30" w:type="dxa"/>
+              <w:left w:w="40" w:type="dxa"/>
+              <w:right w:w="40" w:type="dxa"/>
+            </w:tcMar>
+          </w:tcPr>
+          <w:p>
+            <w:pPr>
+              <w:jc w:val="center"/>
+            </w:pPr>
+            <w:r>
+              <w:rPr>
+                <w:rFonts w:ascii="Calibri" w:hAnsi="Calibri"/>
+                <w:sz w:val="15"/>
+              </w:rPr>
+              <w:t>0.999533</w:t>
+            </w:r>
+          </w:p>
+        </w:tc>
+        <w:tc>
+          <w:tcPr>
+            <w:tcW w:type="dxa" w:w="936"/>
+            <w:tcMar>
+              <w:top w:w="30" w:type="dxa"/>
+              <w:bottom w:w="30" w:type="dxa"/>
+              <w:left w:w="40" w:type="dxa"/>
+              <w:right w:w="40" w:type="dxa"/>
+            </w:tcMar>
+          </w:tcPr>
+          <w:p>
+            <w:pPr>
+              <w:jc w:val="center"/>
+            </w:pPr>
+            <w:r>
+              <w:rPr>
+                <w:rFonts w:ascii="Calibri" w:hAnsi="Calibri"/>
+                <w:sz w:val="15"/>
+              </w:rPr>
+              <w:t>0.927</w:t>
+            </w:r>
+          </w:p>
+        </w:tc>
+        <w:tc>
+          <w:tcPr>
+            <w:tcW w:type="dxa" w:w="936"/>
+            <w:tcMar>
+              <w:top w:w="30" w:type="dxa"/>
+              <w:bottom w:w="30" w:type="dxa"/>
+              <w:left w:w="40" w:type="dxa"/>
+              <w:right w:w="40" w:type="dxa"/>
+            </w:tcMar>
+          </w:tcPr>
+          <w:p>
+            <w:pPr>
+              <w:jc w:val="center"/>
+            </w:pPr>
+            <w:r>
+              <w:rPr>
+                <w:rFonts w:ascii="Calibri" w:hAnsi="Calibri"/>
+                <w:sz w:val="15"/>
+              </w:rPr>
+              <w:t>35.52 (≈1/10/2023)</w:t>
+            </w:r>
+          </w:p>
+        </w:tc>
+        <w:tc>
+          <w:tcPr>
+            <w:tcW w:type="dxa" w:w="936"/>
+            <w:tcMar>
+              <w:top w:w="30" w:type="dxa"/>
+              <w:bottom w:w="30" w:type="dxa"/>
+              <w:left w:w="40" w:type="dxa"/>
+              <w:right w:w="40" w:type="dxa"/>
+            </w:tcMar>
+          </w:tcPr>
+          <w:p>
+            <w:pPr>
+              <w:jc w:val="center"/>
+            </w:pPr>
+            <w:r>
+              <w:rPr>
+                <w:rFonts w:ascii="Calibri" w:hAnsi="Calibri"/>
+                <w:sz w:val="15"/>
+              </w:rPr>
+              <w:t>15 / 3</w:t>
+            </w:r>
+          </w:p>
+        </w:tc>
+        <w:tc>
+          <w:tcPr>
+            <w:tcW w:type="dxa" w:w="936"/>
+            <w:tcMar>
+              <w:top w:w="30" w:type="dxa"/>
+              <w:bottom w:w="30" w:type="dxa"/>
+              <w:left w:w="40" w:type="dxa"/>
+              <w:right w:w="40" w:type="dxa"/>
+            </w:tcMar>
+          </w:tcPr>
+          <w:p>
+            <w:pPr>
+              <w:jc w:val="center"/>
+            </w:pPr>
+            <w:r>
+              <w:rPr>
+                <w:rFonts w:ascii="Calibri" w:hAnsi="Calibri"/>
+                <w:sz w:val="15"/>
+              </w:rPr>
+              <w:t>semana 30.59</w:t>
+            </w:r>
+          </w:p>
+        </w:tc>
+        <w:tc>
+          <w:tcPr>
+            <w:tcW w:type="dxa" w:w="936"/>
+            <w:tcMar>
+              <w:top w:w="30" w:type="dxa"/>
+              <w:bottom w:w="30" w:type="dxa"/>
+              <w:left w:w="40" w:type="dxa"/>
+              <w:right w:w="40" w:type="dxa"/>
+            </w:tcMar>
+          </w:tcPr>
+          <w:p>
+            <w:pPr>
+              <w:jc w:val="center"/>
+            </w:pPr>
+            <w:r>
+              <w:rPr>
+                <w:rFonts w:ascii="Calibri" w:hAnsi="Calibri"/>
+                <w:sz w:val="15"/>
+              </w:rPr>
+              <w:t>semana 26, 4.171 M</w:t>
+            </w:r>
+          </w:p>
+        </w:tc>
+        <w:tc>
+          <w:tcPr>
+            <w:tcW w:type="dxa" w:w="936"/>
+            <w:tcMar>
+              <w:top w:w="30" w:type="dxa"/>
+              <w:bottom w:w="30" w:type="dxa"/>
+              <w:left w:w="40" w:type="dxa"/>
+              <w:right w:w="40" w:type="dxa"/>
+            </w:tcMar>
+          </w:tcPr>
+          <w:p>
+            <w:pPr>
+              <w:jc w:val="center"/>
+            </w:pPr>
+            <w:r>
+              <w:rPr>
+                <w:rFonts w:ascii="Calibri" w:hAnsi="Calibri"/>
+                <w:b/>
+                <w:sz w:val="15"/>
+              </w:rPr>
+              <w:t>aplica</w:t>
+            </w:r>
+          </w:p>
+        </w:tc>
+      </w:tr>
+      <w:tr>
+        <w:tc>
+          <w:tcPr>
+            <w:tcW w:type="dxa" w:w="936"/>
+            <w:tcMar>
+              <w:top w:w="30" w:type="dxa"/>
+              <w:bottom w:w="30" w:type="dxa"/>
+              <w:left w:w="40" w:type="dxa"/>
+              <w:right w:w="40" w:type="dxa"/>
+            </w:tcMar>
+          </w:tcPr>
+          <w:p>
+            <w:pPr>
+              <w:jc w:val="left"/>
+            </w:pPr>
+            <w:r>
+              <w:rPr>
+                <w:rFonts w:ascii="Calibri" w:hAnsi="Calibri"/>
+                <w:sz w:val="15"/>
+              </w:rPr>
+              <w:t>Ella Baila Sola (Eslabón Armado y Peso Pluma)</w:t>
+            </w:r>
+          </w:p>
+        </w:tc>
+        <w:tc>
+          <w:tcPr>
+            <w:tcW w:type="dxa" w:w="936"/>
+            <w:tcMar>
+              <w:top w:w="30" w:type="dxa"/>
+              <w:bottom w:w="30" w:type="dxa"/>
+              <w:left w:w="40" w:type="dxa"/>
+              <w:right w:w="40" w:type="dxa"/>
+            </w:tcMar>
+          </w:tcPr>
+          <w:p>
+            <w:pPr>
+              <w:jc w:val="center"/>
+            </w:pPr>
+            <w:r>
+              <w:rPr>
+                <w:rFonts w:ascii="Calibri" w:hAnsi="Calibri"/>
+                <w:sz w:val="15"/>
+              </w:rPr>
+              <w:t>52 (23/03/2023, estreno)</w:t>
+            </w:r>
+          </w:p>
+        </w:tc>
+        <w:tc>
+          <w:tcPr>
+            <w:tcW w:type="dxa" w:w="936"/>
+            <w:tcMar>
+              <w:top w:w="30" w:type="dxa"/>
+              <w:bottom w:w="30" w:type="dxa"/>
+              <w:left w:w="40" w:type="dxa"/>
+              <w:right w:w="40" w:type="dxa"/>
+            </w:tcMar>
+          </w:tcPr>
+          <w:p>
+            <w:pPr>
+              <w:jc w:val="center"/>
+            </w:pPr>
+            <w:r>
+              <w:rPr>
+                <w:rFonts w:ascii="Calibri" w:hAnsi="Calibri"/>
+                <w:sz w:val="15"/>
+              </w:rPr>
+              <w:t>409.6</w:t>
+            </w:r>
+          </w:p>
+        </w:tc>
+        <w:tc>
+          <w:tcPr>
+            <w:tcW w:type="dxa" w:w="936"/>
+            <w:tcMar>
+              <w:top w:w="30" w:type="dxa"/>
+              <w:bottom w:w="30" w:type="dxa"/>
+              <w:left w:w="40" w:type="dxa"/>
+              <w:right w:w="40" w:type="dxa"/>
+            </w:tcMar>
+          </w:tcPr>
+          <w:p>
+            <w:pPr>
+              <w:jc w:val="center"/>
+            </w:pPr>
+            <w:r>
+              <w:rPr>
+                <w:rFonts w:ascii="Calibri" w:hAnsi="Calibri"/>
+                <w:sz w:val="15"/>
+              </w:rPr>
+              <w:t>0.996265</w:t>
+            </w:r>
+          </w:p>
+        </w:tc>
+        <w:tc>
+          <w:tcPr>
+            <w:tcW w:type="dxa" w:w="936"/>
+            <w:tcMar>
+              <w:top w:w="30" w:type="dxa"/>
+              <w:bottom w:w="30" w:type="dxa"/>
+              <w:left w:w="40" w:type="dxa"/>
+              <w:right w:w="40" w:type="dxa"/>
+            </w:tcMar>
+          </w:tcPr>
+          <w:p>
+            <w:pPr>
+              <w:jc w:val="center"/>
+            </w:pPr>
+            <w:r>
+              <w:rPr>
+                <w:rFonts w:ascii="Calibri" w:hAnsi="Calibri"/>
+                <w:sz w:val="15"/>
+              </w:rPr>
+              <w:t>6.656</w:t>
+            </w:r>
+          </w:p>
+        </w:tc>
+        <w:tc>
+          <w:tcPr>
+            <w:tcW w:type="dxa" w:w="936"/>
+            <w:tcMar>
+              <w:top w:w="30" w:type="dxa"/>
+              <w:bottom w:w="30" w:type="dxa"/>
+              <w:left w:w="40" w:type="dxa"/>
+              <w:right w:w="40" w:type="dxa"/>
+            </w:tcMar>
+          </w:tcPr>
+          <w:p>
+            <w:pPr>
+              <w:jc w:val="center"/>
+            </w:pPr>
+            <w:r>
+              <w:rPr>
+                <w:rFonts w:ascii="Calibri" w:hAnsi="Calibri"/>
+                <w:sz w:val="15"/>
+              </w:rPr>
+              <w:t>3.55 (≈16/04/2023)</w:t>
+            </w:r>
+          </w:p>
+        </w:tc>
+        <w:tc>
+          <w:tcPr>
+            <w:tcW w:type="dxa" w:w="936"/>
+            <w:tcMar>
+              <w:top w:w="30" w:type="dxa"/>
+              <w:bottom w:w="30" w:type="dxa"/>
+              <w:left w:w="40" w:type="dxa"/>
+              <w:right w:w="40" w:type="dxa"/>
+            </w:tcMar>
+          </w:tcPr>
+          <w:p>
+            <w:pPr>
+              <w:jc w:val="center"/>
+            </w:pPr>
+            <w:r>
+              <w:rPr>
+                <w:rFonts w:ascii="Calibri" w:hAnsi="Calibri"/>
+                <w:sz w:val="15"/>
+              </w:rPr>
+              <w:t>19 / 3</w:t>
+            </w:r>
+          </w:p>
+        </w:tc>
+        <w:tc>
+          <w:tcPr>
+            <w:tcW w:type="dxa" w:w="936"/>
+            <w:tcMar>
+              <w:top w:w="30" w:type="dxa"/>
+              <w:bottom w:w="30" w:type="dxa"/>
+              <w:left w:w="40" w:type="dxa"/>
+              <w:right w:w="40" w:type="dxa"/>
+            </w:tcMar>
+          </w:tcPr>
+          <w:p>
+            <w:pPr>
+              <w:jc w:val="center"/>
+            </w:pPr>
+            <w:r>
+              <w:rPr>
+                <w:rFonts w:ascii="Calibri" w:hAnsi="Calibri"/>
+                <w:sz w:val="15"/>
+              </w:rPr>
+              <w:t>no detecta (a = +0.005926)</w:t>
+            </w:r>
+          </w:p>
+        </w:tc>
+        <w:tc>
+          <w:tcPr>
+            <w:tcW w:type="dxa" w:w="936"/>
+            <w:tcMar>
+              <w:top w:w="30" w:type="dxa"/>
+              <w:bottom w:w="30" w:type="dxa"/>
+              <w:left w:w="40" w:type="dxa"/>
+              <w:right w:w="40" w:type="dxa"/>
+            </w:tcMar>
+          </w:tcPr>
+          <w:p>
+            <w:pPr>
+              <w:jc w:val="center"/>
+            </w:pPr>
+            <w:r>
+              <w:rPr>
+                <w:rFonts w:ascii="Calibri" w:hAnsi="Calibri"/>
+                <w:sz w:val="15"/>
+              </w:rPr>
+              <w:t>semana 5, 26.140 M</w:t>
+            </w:r>
+          </w:p>
+        </w:tc>
+        <w:tc>
+          <w:tcPr>
+            <w:tcW w:type="dxa" w:w="936"/>
+            <w:tcMar>
+              <w:top w:w="30" w:type="dxa"/>
+              <w:bottom w:w="30" w:type="dxa"/>
+              <w:left w:w="40" w:type="dxa"/>
+              <w:right w:w="40" w:type="dxa"/>
+            </w:tcMar>
+          </w:tcPr>
+          <w:p>
+            <w:pPr>
+              <w:jc w:val="center"/>
+            </w:pPr>
+            <w:r>
+              <w:rPr>
+                <w:rFonts w:ascii="Calibri" w:hAnsi="Calibri"/>
+                <w:b/>
+                <w:sz w:val="15"/>
+              </w:rPr>
+              <w:t>no aplica</w:t>
+            </w:r>
+          </w:p>
+        </w:tc>
+      </w:tr>
+      <w:tr>
+        <w:tc>
+          <w:tcPr>
+            <w:tcW w:type="dxa" w:w="936"/>
+            <w:tcMar>
+              <w:top w:w="30" w:type="dxa"/>
+              <w:bottom w:w="30" w:type="dxa"/>
+              <w:left w:w="40" w:type="dxa"/>
+              <w:right w:w="40" w:type="dxa"/>
+            </w:tcMar>
+          </w:tcPr>
+          <w:p>
+            <w:pPr>
+              <w:jc w:val="left"/>
+            </w:pPr>
+            <w:r>
+              <w:rPr>
+                <w:rFonts w:ascii="Calibri" w:hAnsi="Calibri"/>
+                <w:sz w:val="15"/>
+              </w:rPr>
+              <w:t>Tití Me Preguntó (Bad Bunny)</w:t>
+            </w:r>
+          </w:p>
+        </w:tc>
+        <w:tc>
+          <w:tcPr>
+            <w:tcW w:type="dxa" w:w="936"/>
+            <w:tcMar>
+              <w:top w:w="30" w:type="dxa"/>
+              <w:bottom w:w="30" w:type="dxa"/>
+              <w:left w:w="40" w:type="dxa"/>
+              <w:right w:w="40" w:type="dxa"/>
+            </w:tcMar>
+          </w:tcPr>
+          <w:p>
+            <w:pPr>
+              <w:jc w:val="center"/>
+            </w:pPr>
+            <w:r>
+              <w:rPr>
+                <w:rFonts w:ascii="Calibri" w:hAnsi="Calibri"/>
+                <w:sz w:val="15"/>
+              </w:rPr>
+              <w:t>52 (12/05/2022, estreno)</w:t>
+            </w:r>
+          </w:p>
+        </w:tc>
+        <w:tc>
+          <w:tcPr>
+            <w:tcW w:type="dxa" w:w="936"/>
+            <w:tcMar>
+              <w:top w:w="30" w:type="dxa"/>
+              <w:bottom w:w="30" w:type="dxa"/>
+              <w:left w:w="40" w:type="dxa"/>
+              <w:right w:w="40" w:type="dxa"/>
+            </w:tcMar>
+          </w:tcPr>
+          <w:p>
+            <w:pPr>
+              <w:jc w:val="center"/>
+            </w:pPr>
+            <w:r>
+              <w:rPr>
+                <w:rFonts w:ascii="Calibri" w:hAnsi="Calibri"/>
+                <w:sz w:val="15"/>
+              </w:rPr>
+              <w:t>298.3</w:t>
+            </w:r>
+          </w:p>
+        </w:tc>
+        <w:tc>
+          <w:tcPr>
+            <w:tcW w:type="dxa" w:w="936"/>
+            <w:tcMar>
+              <w:top w:w="30" w:type="dxa"/>
+              <w:bottom w:w="30" w:type="dxa"/>
+              <w:left w:w="40" w:type="dxa"/>
+              <w:right w:w="40" w:type="dxa"/>
+            </w:tcMar>
+          </w:tcPr>
+          <w:p>
+            <w:pPr>
+              <w:jc w:val="center"/>
+            </w:pPr>
+            <w:r>
+              <w:rPr>
+                <w:rFonts w:ascii="Calibri" w:hAnsi="Calibri"/>
+                <w:sz w:val="15"/>
+              </w:rPr>
+              <w:t>0.999692</w:t>
+            </w:r>
+          </w:p>
+        </w:tc>
+        <w:tc>
+          <w:tcPr>
+            <w:tcW w:type="dxa" w:w="936"/>
+            <w:tcMar>
+              <w:top w:w="30" w:type="dxa"/>
+              <w:bottom w:w="30" w:type="dxa"/>
+              <w:left w:w="40" w:type="dxa"/>
+              <w:right w:w="40" w:type="dxa"/>
+            </w:tcMar>
+          </w:tcPr>
+          <w:p>
+            <w:pPr>
+              <w:jc w:val="center"/>
+            </w:pPr>
+            <w:r>
+              <w:rPr>
+                <w:rFonts w:ascii="Calibri" w:hAnsi="Calibri"/>
+                <w:sz w:val="15"/>
+              </w:rPr>
+              <w:t>1.596</w:t>
+            </w:r>
+          </w:p>
+        </w:tc>
+        <w:tc>
+          <w:tcPr>
+            <w:tcW w:type="dxa" w:w="936"/>
+            <w:tcMar>
+              <w:top w:w="30" w:type="dxa"/>
+              <w:bottom w:w="30" w:type="dxa"/>
+              <w:left w:w="40" w:type="dxa"/>
+              <w:right w:w="40" w:type="dxa"/>
+            </w:tcMar>
+          </w:tcPr>
+          <w:p>
+            <w:pPr>
+              <w:jc w:val="center"/>
+            </w:pPr>
+            <w:r>
+              <w:rPr>
+                <w:rFonts w:ascii="Calibri" w:hAnsi="Calibri"/>
+                <w:sz w:val="15"/>
+              </w:rPr>
+              <w:t>9.87 (≈20/07/2022)</w:t>
+            </w:r>
+          </w:p>
+        </w:tc>
+        <w:tc>
+          <w:tcPr>
+            <w:tcW w:type="dxa" w:w="936"/>
+            <w:tcMar>
+              <w:top w:w="30" w:type="dxa"/>
+              <w:bottom w:w="30" w:type="dxa"/>
+              <w:left w:w="40" w:type="dxa"/>
+              <w:right w:w="40" w:type="dxa"/>
+            </w:tcMar>
+          </w:tcPr>
+          <w:p>
+            <w:pPr>
+              <w:jc w:val="center"/>
+            </w:pPr>
+            <w:r>
+              <w:rPr>
+                <w:rFonts w:ascii="Calibri" w:hAnsi="Calibri"/>
+                <w:sz w:val="15"/>
+              </w:rPr>
+              <w:t>17 / 3</w:t>
+            </w:r>
+          </w:p>
+        </w:tc>
+        <w:tc>
+          <w:tcPr>
+            <w:tcW w:type="dxa" w:w="936"/>
+            <w:tcMar>
+              <w:top w:w="30" w:type="dxa"/>
+              <w:bottom w:w="30" w:type="dxa"/>
+              <w:left w:w="40" w:type="dxa"/>
+              <w:right w:w="40" w:type="dxa"/>
+            </w:tcMar>
+          </w:tcPr>
+          <w:p>
+            <w:pPr>
+              <w:jc w:val="center"/>
+            </w:pPr>
+            <w:r>
+              <w:rPr>
+                <w:rFonts w:ascii="Calibri" w:hAnsi="Calibri"/>
+                <w:sz w:val="15"/>
+              </w:rPr>
+              <w:t>no detecta (a = +0.000279)</w:t>
+            </w:r>
+          </w:p>
+        </w:tc>
+        <w:tc>
+          <w:tcPr>
+            <w:tcW w:type="dxa" w:w="936"/>
+            <w:tcMar>
+              <w:top w:w="30" w:type="dxa"/>
+              <w:bottom w:w="30" w:type="dxa"/>
+              <w:left w:w="40" w:type="dxa"/>
+              <w:right w:w="40" w:type="dxa"/>
+            </w:tcMar>
+          </w:tcPr>
+          <w:p>
+            <w:pPr>
+              <w:jc w:val="center"/>
+            </w:pPr>
+            <w:r>
+              <w:rPr>
+                <w:rFonts w:ascii="Calibri" w:hAnsi="Calibri"/>
+                <w:sz w:val="15"/>
+              </w:rPr>
+              <w:t>semana 6, 9.860 M</w:t>
+            </w:r>
+          </w:p>
+        </w:tc>
+        <w:tc>
+          <w:tcPr>
+            <w:tcW w:type="dxa" w:w="936"/>
+            <w:tcMar>
+              <w:top w:w="30" w:type="dxa"/>
+              <w:bottom w:w="30" w:type="dxa"/>
+              <w:left w:w="40" w:type="dxa"/>
+              <w:right w:w="40" w:type="dxa"/>
+            </w:tcMar>
+          </w:tcPr>
+          <w:p>
+            <w:pPr>
+              <w:jc w:val="center"/>
+            </w:pPr>
+            <w:r>
+              <w:rPr>
+                <w:rFonts w:ascii="Calibri" w:hAnsi="Calibri"/>
+                <w:b/>
+                <w:sz w:val="15"/>
+              </w:rPr>
+              <w:t>no aplica</w:t>
+            </w:r>
+          </w:p>
+        </w:tc>
+      </w:tr>
+    </w:tbl>
+    <w:p>
+      <w:pPr>
+        <w:spacing w:after="160"/>
+      </w:pPr>
+    </w:p>
+    <w:p>
+      <w:r>
+        <w:drawing>
+          <wp:inline xmlns:a="http://schemas.openxmlformats.org/drawingml/2006/main" xmlns:pic="http://schemas.openxmlformats.org/drawingml/2006/picture">
+            <wp:extent cx="4754880" cy="5705856"/>
+            <wp:docPr id="4" name="Picture 4"/>
+            <wp:cNvGraphicFramePr>
+              <a:graphicFrameLocks noChangeAspect="1"/>
+            </wp:cNvGraphicFramePr>
+            <a:graphic>
+              <a:graphicData uri="http://schemas.openxmlformats.org/drawingml/2006/picture">
+                <pic:pic>
+                  <pic:nvPicPr>
+                    <pic:cNvPr id="0" name="grafico_4_comparacion_canciones.png"/>
+                    <pic:cNvPicPr/>
+                  </pic:nvPicPr>
+                  <pic:blipFill>
+                    <a:blip r:embed="rId12"/>
+                    <a:stretch>
+                      <a:fillRect/>
+                    </a:stretch>
+                  </pic:blipFill>
+                  <pic:spPr>
+                    <a:xfrm>
+                      <a:off x="0" y="0"/>
+                      <a:ext cx="4754880" cy="5705856"/>
+                    </a:xfrm>
+                    <a:prstGeom prst="rect"/>
+                  </pic:spPr>
+                </pic:pic>
+              </a:graphicData>
+            </a:graphic>
+          </wp:inline>
+        </w:drawing>
+      </w:r>
+    </w:p>
+    <w:p>
+      <w:pPr>
+        <w:jc w:val="center"/>
+      </w:pPr>
+      <w:r>
+        <w:rPr>
+          <w:i/>
+          <w:color w:val="595959"/>
+          <w:sz w:val="19"/>
+        </w:rPr>
+        <w:t>Figura 4: Streams semanales medidos y derivada del modelo S'(t) para las tres canciones analizadas. Se observa cómo la cúbica ajusta con alto R² pero genera una derivada parabólica cóncava hacia arriba en los estrenos (a &gt; 0), provocando un repunte irreal hacia el final del año.</w:t>
+      </w:r>
+    </w:p>
+    <w:p>
+      <w:pPr>
+        <w:spacing w:after="240"/>
+      </w:pPr>
+      <w:r>
+        <w:t>Del análisis sistemático de la tabla comparativa y la Figura 4 se desprenden las siguientes conclusiones y principios clave:</w:t>
+        <w:br/>
+        <w:br/>
+        <w:t>1. Regla de validación matemática del pico: El ritmo de reproducciones está dado por la derivada primera S'(t) = 3a·t² + 2b·t + c, que corresponde a una parábola. El punto de inflexión del modelo continuo se ubica donde S''(t) = 6a·t + 2b = 0, es decir, en t = -b/(3a). Este punto es un MÁXIMO local del ritmo de streams únicamente si la parábola abre hacia abajo, lo que exige estrictamente que a &lt; 0 y que el valor t caiga dentro del intervalo de semanas observadas. Si a &gt; 0, la parábola abre hacia arriba y el punto t = -b/(3a) representa un MÍNIMO del ritmo de streams; por ende, en este caso la función cúbica resulta matemáticamente incapaz de modelar el pico de la serie.</w:t>
+        <w:br/>
+        <w:br/>
+        <w:t>2. Resurgimiento gradual (Rosa Pastel): "Rosa Pastel" describe un fenómeno de resurgimiento gradual: sube sostenidamente durante varios meses hasta alcanzar un pico a mediados de 2023 y luego decae paulatinamente. La regresión cúbica obtiene a = -0.000839 &lt; 0, por lo que encuentra de forma consistente el pico en la semana 30.59. El diagnóstico es que el modelo aplica.</w:t>
+        <w:br/>
+        <w:br/>
+        <w:t>3. Dinámica de estrenos y falacia del R² alto: Los estrenos comerciales ("Ella Baila Sola" y "Tití Me Preguntó") arrancan directamente en o muy cerca de su pico histórico debido a la expectativa del lanzamiento, y a partir de allí experimentan un decaimiento sostenido. Al ajustar un polinomio cúbico a estos perfiles, el modelo obtiene coeficientes principales positivos (a = +0.005926 y a = +0.000279). En consecuencia, la derivada cuadrática vuelve a subir de manera pronunciada e irreal hacia el final del período analizado (comportamiento claramente visible en el gráfico 4 para Ella Baila Sola). A pesar de esta incoherencia física evidente, el coeficiente de determinación R² se mantiene altísimo (0.996265 y 0.999692). Esto evidencia un principio esencial de la práctica de ingeniería: un R² alto no garantiza que el modelo sirva para todo ni que represente adecuadamente la dinámica física real.</w:t>
+        <w:br/>
+        <w:br/>
+        <w:t>4. Universalidad de los componentes generales: Aunque la cúbica no sea idónea para predecir el pico en estrenos, las demás herramientas numéricas implementadas funcionan de forma universal para todas las canciones: la búsqueda de raíces para determinar cuándo se alcanzaron los 100 millones de streams convergió dentro de la tolerancia fijada en los tres casos (Bisección en 15 a 19 iteraciones; Newton-Raphson en exactamente 3 iteraciones), y el cálculo de derivadas discretas por diferencias finitas localizó certeramente el pico real de los datos empíricos.</w:t>
+        <w:br/>
+        <w:br/>
+        <w:t>5. Detección automática del intervalo en Tití Me Preguntó: En los datos reales acumulados de Tití Me Preguntó, el cruce de los 100 millones ocurre entre las semanas 10 y 11 (interpolación lineal en t = 10.04 semanas), pero la función del modelo cúbico cruza dicho umbral entre las semanas 9 y 10 (con raíz en t* = 9.87 semanas). El algoritmo programado detecta automáticamente el intervalo de cambio de signo sobre la función del modelo f(t) = S(t) - 100 y utiliza dicho intervalo para inicializar Bisección y fijar el punto de partida de Newton-Raphson. Este desfase responde al mismo efecto ya analizado: la regresión por mínimos cuadrados minimiza los residuos globales pero no pasa exactamente por los puntos observados.</w:t>
+        <w:br/>
+        <w:br/>
+        <w:t>6. Valor de ingeniería y líneas futuras: El mayor valor de la herramienta desarrollada como proyecto de ingeniería radica en su reutilización y en su capacidad de autodiagnóstico: ante cualquier serie de demanda, calcula metas acumuladas y comprueba automáticamente la validez del modelo para estimar el pico. Además, el software avisa explícitamente cuando no aplica ("no aplica"), evitando emitir estimaciones falsas o carentes de sustento. Como mejora y trabajo futuro para canciones de estreno, se plantea incorporar modelos basados en decaimiento exponencial con linealización logarítmica (abordados en el apunte de ajuste de curvas).</w:t>
+      </w:r>
+    </w:p>
+    <w:p>
+      <w:r>
+        <w:br w:type="page"/>
+      </w:r>
+    </w:p>
+    <w:p>
+      <w:pPr>
+        <w:keepNext/>
+        <w:spacing w:before="280" w:after="120"/>
+      </w:pPr>
+      <w:r>
+        <w:rPr>
+          <w:rFonts w:ascii="Calibri" w:hAnsi="Calibri"/>
+          <w:b/>
+          <w:color w:val="1F4E79"/>
+          <w:sz w:val="25"/>
+        </w:rPr>
+        <w:t>3.7 Limitaciones del Modelo Numérico</w:t>
       </w:r>
     </w:p>
     <w:p>
@@ -11120,16 +12287,19 @@
         <w:t>El análisis numérico realizado presenta una serie de limitaciones técnicas y metodológicas que deben considerarse al interpretar los resultados:</w:t>
         <w:br/>
         <w:br/>
-        <w:t>1. La cúbica no pasa por los puntos: El ajuste por mínimos cuadrados minimiza la suma de residuos cuadráticos globales, pero no garantiza que la curva pase por los puntos observados. Por este motivo, la raíz del modelo para los 100 millones (t* = 35.52 semanas) difiere en aproximadamente 2.75 días respecto a la interpolación lineal directa entre las semanas 35 y 36 (t = 35.13 semanas). Esta discrepancia es inherente al compromiso entre simplicidad analítica y precisión local.</w:t>
+        <w:t>1. La cúbica no pasa por los puntos: El ajuste por mínimos cuadrados minimiza la suma de residuos cuadráticos globales, pero no garantiza que la curva pase por los puntos observados. Por este motivo, la raíz del modelo para los 100 millones (t* = 35.52 semanas en Rosa Pastel) difiere en aproximadamente 2.75 días respecto a la interpolación lineal directa entre las semanas 35 y 36 (t = 35.13 semanas). Esta discrepancia es inherente al compromiso entre simplicidad analítica y precisión local.</w:t>
         <w:br/>
         <w:br/>
-        <w:t>2. Suavizado del pico de demanda: Al ajustar un único polinomio cúbico a lo largo de 47 semanas, el modelo no puede capturar cambios abruptos en la pendiente. En consecuencia, el pico real registrado a fines de julio (semana 26, con 4.171 M streams) es desplazado por el modelo hacia fines de agosto (semana 30.6) y atenuado a 3.436 M streams/semana.</w:t>
+        <w:t>2. Suavizado del pico de demanda: Al ajustar un único polinomio cúbico a lo largo de la serie temporal, el modelo atenúa los cambios abruptos de pendiente. En Rosa Pastel, el pico real de la semana 26 (4.171 M streams) es desplazado por el modelo hacia la semana 30.6 y atenuado a 3.436 M streams/semana.</w:t>
         <w:br/>
         <w:br/>
-        <w:t>3. Alcance de los datos: Las cifras empleadas provienen exclusivamente de los charts semanales del Top 200 de Spotify México (kworb.net). No contemplan las reproducciones en otras plataformas masivas de streaming (como YouTube o Apple Music), ni el consumo en otros países de habla hispana donde el fenómeno también se replicó, ni las escuchas por debajo del umbral del Top 200.</w:t>
+        <w:t>3. Tipología de curvas admisibles y dinámica de estrenos: La regresión cúbica solo es capaz de modelar trayectorias que presenten un único pico interior de ritmo (aquel donde a &lt; 0, con etapa de aceleración previa e inflexión posterior). En canciones de estreno comercial (como Ella Baila Sola o Tití Me Preguntó), donde el consumo máximo ocurre inmediatamente tras el lanzamiento y luego decae de forma sostenida, la cúbica genera a &gt; 0 y su derivada exhibe un rebote ficticio al final. Para modelar adecuadamente los estrenos se requiere otro tipo de modelo matemático, como un decaimiento exponencial con linealización.</w:t>
         <w:br/>
         <w:br/>
-        <w:t>4. Imposibilidad de extrapolación fuera de 2023: El modelo cúbico es estrictamente descriptivo para el intervalo observado (t ∈ [0, 46]). Debido a que el coeficiente de mayor orden es negativo (a = -0.000839), evaluar la función fuera de 2023 conduciría a un decaimiento monótono hacia -∞, lo cual carece de sentido físico para un valor de reproducciones acumuladas.</w:t>
+        <w:t>4. Alcance de los datos: Las cifras empleadas provienen exclusivamente de los charts semanales del Top 200 de Spotify México (kworb.net). No contemplan las reproducciones en otras plataformas masivas de streaming (como YouTube o Apple Music), ni el consumo en otros países de habla hispana donde el fenómeno también se replicó, ni las escuchas por debajo del umbral del Top 200.</w:t>
+        <w:br/>
+        <w:br/>
+        <w:t>5. Imposibilidad de extrapolación fuera del rango observado: El modelo cúbico es estrictamente descriptivo para el intervalo relevado. Debido a que el coeficiente de mayor orden en Rosa Pastel es negativo (a = -0.000839), evaluar la función fuera de 2023 conduciría a un decaimiento monótono hacia -∞, lo cual carece de sentido físico para un valor de reproducciones acumuladas.</w:t>
       </w:r>
     </w:p>
     <w:p>
@@ -11155,7 +12325,7 @@
         <w:t>A partir de los cálculos realizados y el análisis de los resultados obtenidos, se extraen las siguientes conclusiones:</w:t>
         <w:br/>
         <w:br/>
-        <w:t>1. Ajuste de Curvas: La regresión polinómica cúbica ofreció una aproximación muy representativa de la acumulación anual de streams en Spotify México, alcanzando un coeficiente de determinación R² = 0.9995 y un error estándar Sy/x = 0.927 M. El modelo describe con claridad las etapas de crecimiento acelerado e inflexión hacia una etapa más estable.</w:t>
+        <w:t>1. Ajuste de Curvas: La regresión polinómica cúbica ofreció una aproximación muy representativa de la acumulación anual de streams en Spotify México para Rosa Pastel, alcanzando un coeficiente de determinación R² = 0.9995 y un error estándar Sy/x = 0.927 M. El modelo describe con claridad las etapas de crecimiento acelerado e inflexión hacia una etapa más estable.</w:t>
         <w:br/>
         <w:br/>
         <w:t>2. Desempeño Comparativo de Búsqueda de Raíces: Ambos métodos numéricos permitieron ubicar el hito de los 100 millones de reproducciones en la semana 35.52 (fines de septiembre / 1 de octubre de 2023), con una diferencia entre ambos de solo 0.00002 semanas. Sin embargo, Newton-Raphson demostró ser notablemente más veloz que Bisección (3 iteraciones frente a 15) gracias a su convergencia cuadrática, confirmando lo anticipado por la teoría.</w:t>
@@ -11168,6 +12338,9 @@
         <w:br/>
         <w:br/>
         <w:t>5. Utilidad en Ingeniería: El ejercicio evidenció cómo las herramientas clásicas de métodos numéricos permiten convertir un conjunto de datos discretos de telemetría en información continua utilizable para la toma de decisiones, como la planificación de recursos computacionales y el dimensionamiento de servidores de streaming ante variaciones de demanda.</w:t>
+        <w:br/>
+        <w:br/>
+        <w:t>6. Generalización y Criterio de Aplicabilidad en Ingeniería: Al extender el método a otras canciones ("Ella Baila Sola" y "Tití Me Preguntó"), se constató que mientras la búsqueda de raíces para metas acumuladas y el cálculo de derivadas discretas resultan universales y altamente eficientes (Newton convergió siempre en 3 iteraciones), la regresión cúbica no resulta aplicable para predecir el pico en estrenos comerciales sin aceleración previa (a &gt; 0). Esto demostró que un R² sumamente elevado (&gt; 0.996) no garantiza la validez física del modelo. El valor de ingeniería de la herramienta radica en su modularidad, reutilización y capacidad de autodiagnóstico para notificar cuándo un modelo no aplica en lugar de arrojar resultados falsos, señalando la conveniencia de integrar modelos alternativos (como decaimiento exponencial con linealización).</w:t>
       </w:r>
     </w:p>
     <w:p>
@@ -11198,7 +12371,11 @@
         <w:br/>
         <w:t>4. kworb.net. (2026). Spotify Chart History – Belanova "Rosa Pastel" (Track 6Z0ybnsUBhbZ9ZjPW64eoF). Disponible en: https://kworb.net/spotify/track/6Z0ybnsUBhbZ9ZjPW64eoF.html (consultado el 22/10/2026).</w:t>
         <w:br/>
-        <w:t>5. Chilango. (2023). "Rosa Pastel, la triste tendencia de TikTok que musicaliza sueños frustrados". Disponible en: https://www.chilango.com/agenda/otros/rosa-pastel-tiktok-tendencia/ (publicado el 12 de julio de 2023).</w:t>
+        <w:t>5. kworb.net. (2026). Spotify Chart History – Eslabón Armado y Peso Pluma "Ella Baila Sola" (Track 3qQbCzHBycnDpGskqOWY0E). Disponible en: https://kworb.net/spotify/track/3qQbCzHBycnDpGskqOWY0E.html (consultado el 27/10/2026).</w:t>
+        <w:br/>
+        <w:t>6. kworb.net. (2026). Spotify Chart History – Bad Bunny "Tití Me Preguntó" (Track 1IHWl5LamUGEuP4ozKQSXZ). Disponible en: https://kworb.net/spotify/track/1IHWl5LamUGEuP4ozKQSXZ.html (consultado el 27/10/2026).</w:t>
+        <w:br/>
+        <w:t>7. Chilango. (2023). "Rosa Pastel, la triste tendencia de TikTok que musicaliza sueños frustrados". Disponible en: https://www.chilango.com/agenda/otros/rosa-pastel-tiktok-tendencia/ (publicado el 12 de julio de 2023).</w:t>
         <w:br/>
         <w:br/>
         <w:t>DECLARACIÓN SOBRE EL USO DE HERRAMIENTAS DE INTELIGENCIA ARTIFICIAL:</w:t>

</xml_diff>